<commit_message>
Invoice: full T&Cs in the preview; packages listed without repeating events
The preview's Terms & Conditions page now shows the full text, word for
word as in the template (a new test fails if they drift apart).

Page 2 no longer repeats the event above its benefits. Each package is a
bold 'Event Partner:' line with its bullet points underneath; events on
the same package share one block, and the events are only named beside a
package when the invoice has more than one.

Co-Authored-By: Claude Opus 5.5 <noreply@anthropic.com>
Claude-Session: https://claude.ai/code/session_013bXWJ1EZK4HsfzrgTMZCJH
</commit_message>
<xml_diff>
--- a/public/invoice_template.docx
+++ b/public/invoice_template.docx
@@ -1873,6 +1873,14 @@
     <w:p>
       <w:pPr>
         <w:spacing w:line="240" w:lineRule="auto"/>
+      </w:pPr>
+      <w:r>
+        <w:t>{{#packages}}</w:t>
+      </w:r>
+    </w:p>
+    <w:p>
+      <w:pPr>
+        <w:spacing w:before="200" w:after="60" w:line="240" w:lineRule="auto"/>
         <w:rPr>
           <w:rFonts w:ascii="Aptos" w:eastAsia="Aptos" w:hAnsi="Aptos" w:cs="Aptos"/>
           <w:color w:val="auto"/>
@@ -1890,11 +1898,10 @@
           <w:color w:val="auto"/>
           <w:sz w:val="20"/>
           <w:szCs w:val="20"/>
-          <w:u w:val="single"/>
           <w:lang w:val="en-GB" w:eastAsia="en-US"/>
           <w14:ligatures w14:val="standardContextual"/>
         </w:rPr>
-        <w:t>{{package_name}}</w:t>
+        <w:t>{{title}}</w:t>
       </w:r>
     </w:p>
     <w:p>
@@ -1910,7 +1917,7 @@
         </w:rPr>
       </w:pPr>
       <w:r>
-        <w:t>{{#benefits}}</w:t>
+        <w:t>{{#items}}</w:t>
       </w:r>
     </w:p>
     <w:p>
@@ -1954,7 +1961,15 @@
         </w:rPr>
       </w:pPr>
       <w:r>
-        <w:t>{{/benefits}}</w:t>
+        <w:t>{{/items}}</w:t>
+      </w:r>
+    </w:p>
+    <w:p>
+      <w:pPr>
+        <w:spacing w:line="240" w:lineRule="auto"/>
+      </w:pPr>
+      <w:r>
+        <w:t>{{/packages}}</w:t>
       </w:r>
     </w:p>
     <w:p>

</xml_diff>